<commit_message>
updated insurance charge prediction accuracy report
</commit_message>
<xml_diff>
--- a/Insurance charge Prediction Assignment.docx
+++ b/Insurance charge Prediction Assignment.docx
@@ -851,21 +851,7 @@
         <w:rPr>
           <w:rFonts w:ascii="Arial" w:hAnsi="Arial" w:cs="Arial"/>
         </w:rPr>
-        <w:t xml:space="preserve">In Python code, this can be achieved using the </w:t>
-      </w:r>
-      <w:proofErr w:type="spellStart"/>
-      <w:r>
-        <w:rPr>
-          <w:rFonts w:ascii="Arial" w:hAnsi="Arial" w:cs="Arial"/>
-        </w:rPr>
-        <w:t>pandas.get_dummies</w:t>
-      </w:r>
-      <w:proofErr w:type="spellEnd"/>
-      <w:r>
-        <w:rPr>
-          <w:rFonts w:ascii="Arial" w:hAnsi="Arial" w:cs="Arial"/>
-        </w:rPr>
-        <w:t xml:space="preserve"> () function.</w:t>
+        <w:t>In Python code, this can be achieved using the pandas.get_dummies () function.</w:t>
       </w:r>
     </w:p>
     <w:p>
@@ -912,29 +898,7 @@
           <w:sz w:val="24"/>
           <w:szCs w:val="24"/>
         </w:rPr>
-        <w:t xml:space="preserve">My final model is a Random Forest </w:t>
-      </w:r>
-      <w:proofErr w:type="spellStart"/>
-      <w:r>
-        <w:rPr>
-          <w:rFonts w:ascii="Arial" w:eastAsia="Times New Roman" w:hAnsi="Arial" w:cs="Arial"/>
-          <w:i/>
-          <w:iCs/>
-          <w:sz w:val="24"/>
-          <w:szCs w:val="24"/>
-        </w:rPr>
-        <w:t>Regressor</w:t>
-      </w:r>
-      <w:proofErr w:type="spellEnd"/>
-      <w:r>
-        <w:rPr>
-          <w:rFonts w:ascii="Arial" w:eastAsia="Times New Roman" w:hAnsi="Arial" w:cs="Arial"/>
-          <w:i/>
-          <w:iCs/>
-          <w:sz w:val="24"/>
-          <w:szCs w:val="24"/>
-        </w:rPr>
-        <w:t>.</w:t>
+        <w:t>My final model is a Random Forest Regressor.</w:t>
       </w:r>
     </w:p>
     <w:p>
@@ -1525,25 +1489,7 @@
           <w:rFonts w:ascii="Arial" w:hAnsi="Arial" w:cs="Arial"/>
           <w:i w:val="0"/>
         </w:rPr>
-        <w:t xml:space="preserve"> using a Decision Tree </w:t>
-      </w:r>
-      <w:proofErr w:type="spellStart"/>
-      <w:r>
-        <w:rPr>
-          <w:rStyle w:val="Emphasis"/>
-          <w:rFonts w:ascii="Arial" w:hAnsi="Arial" w:cs="Arial"/>
-          <w:i w:val="0"/>
-        </w:rPr>
-        <w:t>Regressor</w:t>
-      </w:r>
-      <w:proofErr w:type="spellEnd"/>
-      <w:r>
-        <w:rPr>
-          <w:rStyle w:val="Emphasis"/>
-          <w:rFonts w:ascii="Arial" w:hAnsi="Arial" w:cs="Arial"/>
-          <w:i w:val="0"/>
-        </w:rPr>
-        <w:t>.</w:t>
+        <w:t xml:space="preserve"> using a Decision Tree Regressor.</w:t>
       </w:r>
     </w:p>
     <w:p>
@@ -1563,25 +1509,7 @@
           <w:rFonts w:ascii="Arial" w:hAnsi="Arial" w:cs="Arial"/>
           <w:i w:val="0"/>
         </w:rPr>
-        <w:t xml:space="preserve">I applied </w:t>
-      </w:r>
-      <w:proofErr w:type="spellStart"/>
-      <w:r>
-        <w:rPr>
-          <w:rStyle w:val="Emphasis"/>
-          <w:rFonts w:ascii="Arial" w:hAnsi="Arial" w:cs="Arial"/>
-          <w:i w:val="0"/>
-        </w:rPr>
-        <w:t>hyperparameter</w:t>
-      </w:r>
-      <w:proofErr w:type="spellEnd"/>
-      <w:r>
-        <w:rPr>
-          <w:rStyle w:val="Emphasis"/>
-          <w:rFonts w:ascii="Arial" w:hAnsi="Arial" w:cs="Arial"/>
-          <w:i w:val="0"/>
-        </w:rPr>
-        <w:t xml:space="preserve"> tuning to find the best-performing model. The parameters I tuned include:</w:t>
+        <w:t>I applied hyperparameter tuning to find the best-performing model. The parameters I tuned include:</w:t>
       </w:r>
     </w:p>
     <w:p>
@@ -1606,63 +1534,7 @@
         <w:rPr>
           <w:rFonts w:ascii="Arial" w:hAnsi="Arial" w:cs="Arial"/>
         </w:rPr>
-        <w:t xml:space="preserve"> {"</w:t>
-      </w:r>
-      <w:proofErr w:type="spellStart"/>
-      <w:r>
-        <w:rPr>
-          <w:rFonts w:ascii="Arial" w:hAnsi="Arial" w:cs="Arial"/>
-        </w:rPr>
-        <w:t>squared_error</w:t>
-      </w:r>
-      <w:proofErr w:type="spellEnd"/>
-      <w:r>
-        <w:rPr>
-          <w:rFonts w:ascii="Arial" w:hAnsi="Arial" w:cs="Arial"/>
-        </w:rPr>
-        <w:t>", "</w:t>
-      </w:r>
-      <w:proofErr w:type="spellStart"/>
-      <w:r>
-        <w:rPr>
-          <w:rFonts w:ascii="Arial" w:hAnsi="Arial" w:cs="Arial"/>
-        </w:rPr>
-        <w:t>friedman_mse</w:t>
-      </w:r>
-      <w:proofErr w:type="spellEnd"/>
-      <w:r>
-        <w:rPr>
-          <w:rFonts w:ascii="Arial" w:hAnsi="Arial" w:cs="Arial"/>
-        </w:rPr>
-        <w:t>", "</w:t>
-      </w:r>
-      <w:proofErr w:type="spellStart"/>
-      <w:r>
-        <w:rPr>
-          <w:rFonts w:ascii="Arial" w:hAnsi="Arial" w:cs="Arial"/>
-        </w:rPr>
-        <w:t>absolute_error</w:t>
-      </w:r>
-      <w:proofErr w:type="spellEnd"/>
-      <w:r>
-        <w:rPr>
-          <w:rFonts w:ascii="Arial" w:hAnsi="Arial" w:cs="Arial"/>
-        </w:rPr>
-        <w:t>", "</w:t>
-      </w:r>
-      <w:proofErr w:type="spellStart"/>
-      <w:r>
-        <w:rPr>
-          <w:rFonts w:ascii="Arial" w:hAnsi="Arial" w:cs="Arial"/>
-        </w:rPr>
-        <w:t>poisson</w:t>
-      </w:r>
-      <w:proofErr w:type="spellEnd"/>
-      <w:r>
-        <w:rPr>
-          <w:rFonts w:ascii="Arial" w:hAnsi="Arial" w:cs="Arial"/>
-        </w:rPr>
-        <w:t>"}</w:t>
+        <w:t xml:space="preserve"> {"squared_error", "friedman_mse", "absolute_error", "poisson"}</w:t>
       </w:r>
     </w:p>
     <w:p>
@@ -1701,55 +1573,18 @@
           <w:rFonts w:ascii="Arial" w:hAnsi="Arial" w:cs="Arial"/>
         </w:rPr>
       </w:pPr>
-      <w:proofErr w:type="spellStart"/>
       <w:r>
         <w:rPr>
           <w:rStyle w:val="Strong"/>
           <w:rFonts w:ascii="Arial" w:eastAsiaTheme="majorEastAsia" w:hAnsi="Arial" w:cs="Arial"/>
         </w:rPr>
-        <w:t>max_features</w:t>
-      </w:r>
-      <w:proofErr w:type="spellEnd"/>
-      <w:r>
-        <w:rPr>
-          <w:rStyle w:val="Strong"/>
-          <w:rFonts w:ascii="Arial" w:eastAsiaTheme="majorEastAsia" w:hAnsi="Arial" w:cs="Arial"/>
-        </w:rPr>
-        <w:t>:</w:t>
+        <w:t>max_features:</w:t>
       </w:r>
       <w:r>
         <w:rPr>
           <w:rFonts w:ascii="Arial" w:hAnsi="Arial" w:cs="Arial"/>
         </w:rPr>
-        <w:t xml:space="preserve"> </w:t>
-      </w:r>
-      <w:proofErr w:type="spellStart"/>
-      <w:r>
-        <w:rPr>
-          <w:rFonts w:ascii="Arial" w:hAnsi="Arial" w:cs="Arial"/>
-        </w:rPr>
-        <w:t>int</w:t>
-      </w:r>
-      <w:proofErr w:type="spellEnd"/>
-      <w:r>
-        <w:rPr>
-          <w:rFonts w:ascii="Arial" w:hAnsi="Arial" w:cs="Arial"/>
-        </w:rPr>
-        <w:t>, float, or {"</w:t>
-      </w:r>
-      <w:proofErr w:type="spellStart"/>
-      <w:r>
-        <w:rPr>
-          <w:rFonts w:ascii="Arial" w:hAnsi="Arial" w:cs="Arial"/>
-        </w:rPr>
-        <w:t>sqrt</w:t>
-      </w:r>
-      <w:proofErr w:type="spellEnd"/>
-      <w:r>
-        <w:rPr>
-          <w:rFonts w:ascii="Arial" w:hAnsi="Arial" w:cs="Arial"/>
-        </w:rPr>
-        <w:t>", "log2"}</w:t>
+        <w:t xml:space="preserve"> int, float, or {"sqrt", "log2"}</w:t>
       </w:r>
     </w:p>
     <w:p>
@@ -1789,61 +1624,7 @@
           <w:rFonts w:ascii="Arial" w:hAnsi="Arial" w:cs="Arial"/>
           <w:i w:val="0"/>
         </w:rPr>
-        <w:t>criterion = "</w:t>
-      </w:r>
-      <w:proofErr w:type="spellStart"/>
-      <w:r>
-        <w:rPr>
-          <w:rStyle w:val="Emphasis"/>
-          <w:rFonts w:ascii="Arial" w:hAnsi="Arial" w:cs="Arial"/>
-          <w:i w:val="0"/>
-        </w:rPr>
-        <w:t>absolute_error</w:t>
-      </w:r>
-      <w:proofErr w:type="spellEnd"/>
-      <w:r>
-        <w:rPr>
-          <w:rStyle w:val="Emphasis"/>
-          <w:rFonts w:ascii="Arial" w:hAnsi="Arial" w:cs="Arial"/>
-          <w:i w:val="0"/>
-        </w:rPr>
-        <w:t xml:space="preserve">", splitter = "best", </w:t>
-      </w:r>
-      <w:proofErr w:type="spellStart"/>
-      <w:r>
-        <w:rPr>
-          <w:rStyle w:val="Emphasis"/>
-          <w:rFonts w:ascii="Arial" w:hAnsi="Arial" w:cs="Arial"/>
-          <w:i w:val="0"/>
-        </w:rPr>
-        <w:t>max_features</w:t>
-      </w:r>
-      <w:proofErr w:type="spellEnd"/>
-      <w:r>
-        <w:rPr>
-          <w:rStyle w:val="Emphasis"/>
-          <w:rFonts w:ascii="Arial" w:hAnsi="Arial" w:cs="Arial"/>
-          <w:i w:val="0"/>
-        </w:rPr>
-        <w:t xml:space="preserve"> = "</w:t>
-      </w:r>
-      <w:proofErr w:type="spellStart"/>
-      <w:r>
-        <w:rPr>
-          <w:rStyle w:val="Emphasis"/>
-          <w:rFonts w:ascii="Arial" w:hAnsi="Arial" w:cs="Arial"/>
-          <w:i w:val="0"/>
-        </w:rPr>
-        <w:t>sqrt</w:t>
-      </w:r>
-      <w:proofErr w:type="spellEnd"/>
-      <w:r>
-        <w:rPr>
-          <w:rStyle w:val="Emphasis"/>
-          <w:rFonts w:ascii="Arial" w:hAnsi="Arial" w:cs="Arial"/>
-          <w:i w:val="0"/>
-        </w:rPr>
-        <w:t xml:space="preserve">" → </w:t>
+        <w:t xml:space="preserve">criterion = "absolute_error", splitter = "best", max_features = "sqrt" → </w:t>
       </w:r>
       <w:r>
         <w:rPr>
@@ -1871,51 +1652,15 @@
           <w:rFonts w:ascii="Arial" w:hAnsi="Arial" w:cs="Arial"/>
           <w:i w:val="0"/>
         </w:rPr>
-        <w:t>criterion = "</w:t>
+        <w:t xml:space="preserve">criterion = "absolute_error", splitter </w:t>
       </w:r>
-      <w:proofErr w:type="spellStart"/>
       <w:r>
         <w:rPr>
           <w:rStyle w:val="Emphasis"/>
           <w:rFonts w:ascii="Arial" w:hAnsi="Arial" w:cs="Arial"/>
           <w:i w:val="0"/>
         </w:rPr>
-        <w:t>absolute_error</w:t>
-      </w:r>
-      <w:proofErr w:type="spellEnd"/>
-      <w:r>
-        <w:rPr>
-          <w:rStyle w:val="Emphasis"/>
-          <w:rFonts w:ascii="Arial" w:hAnsi="Arial" w:cs="Arial"/>
-          <w:i w:val="0"/>
-        </w:rPr>
-        <w:t xml:space="preserve">", splitter </w:t>
-      </w:r>
-      <w:r>
-        <w:rPr>
-          <w:rStyle w:val="Emphasis"/>
-          <w:rFonts w:ascii="Arial" w:hAnsi="Arial" w:cs="Arial"/>
-          <w:i w:val="0"/>
-        </w:rPr>
-        <w:t xml:space="preserve">= "best", </w:t>
-      </w:r>
-      <w:proofErr w:type="spellStart"/>
-      <w:r>
-        <w:rPr>
-          <w:rStyle w:val="Emphasis"/>
-          <w:rFonts w:ascii="Arial" w:hAnsi="Arial" w:cs="Arial"/>
-          <w:i w:val="0"/>
-        </w:rPr>
-        <w:t>max_features</w:t>
-      </w:r>
-      <w:proofErr w:type="spellEnd"/>
-      <w:r>
-        <w:rPr>
-          <w:rStyle w:val="Emphasis"/>
-          <w:rFonts w:ascii="Arial" w:hAnsi="Arial" w:cs="Arial"/>
-          <w:i w:val="0"/>
-        </w:rPr>
-        <w:t xml:space="preserve"> = "log2"</w:t>
+        <w:t>= "best", max_features = "log2"</w:t>
       </w:r>
       <w:r>
         <w:rPr>
@@ -1985,17 +1730,7 @@
           <w:iCs/>
           <w:highlight w:val="yellow"/>
         </w:rPr>
-        <w:t xml:space="preserve">78% </w:t>
-      </w:r>
-      <w:proofErr w:type="gramStart"/>
-      <w:r>
-        <w:rPr>
-          <w:rStyle w:val="Strong"/>
-          <w:rFonts w:ascii="Arial" w:eastAsiaTheme="majorEastAsia" w:hAnsi="Arial" w:cs="Arial"/>
-          <w:iCs/>
-          <w:highlight w:val="yellow"/>
-        </w:rPr>
-        <w:t>accuracy</w:t>
+        <w:t>78% accuracy</w:t>
       </w:r>
       <w:r>
         <w:rPr>
@@ -2011,16 +1746,7 @@
           <w:rFonts w:ascii="Arial" w:hAnsi="Arial" w:cs="Arial"/>
           <w:i w:val="0"/>
         </w:rPr>
-        <w:t>)</w:t>
-      </w:r>
-      <w:proofErr w:type="gramEnd"/>
-      <w:r>
-        <w:rPr>
-          <w:rStyle w:val="Emphasis"/>
-          <w:rFonts w:ascii="Arial" w:hAnsi="Arial" w:cs="Arial"/>
-          <w:i w:val="0"/>
-        </w:rPr>
-        <w:t xml:space="preserve"> </w:t>
+        <w:t xml:space="preserve">) </w:t>
       </w:r>
       <w:r>
         <w:rPr>
@@ -2612,27 +2338,7 @@
                 <w:color w:val="000000"/>
               </w:rPr>
               <w:br/>
-              <w:t>(</w:t>
-            </w:r>
-            <w:proofErr w:type="spellStart"/>
-            <w:r>
-              <w:rPr>
-                <w:rFonts w:ascii="Arial" w:eastAsia="Times New Roman" w:hAnsi="Arial" w:cs="Arial"/>
-                <w:b/>
-                <w:bCs/>
-                <w:color w:val="000000"/>
-              </w:rPr>
-              <w:t>random_state</w:t>
-            </w:r>
-            <w:proofErr w:type="spellEnd"/>
-            <w:r>
-              <w:rPr>
-                <w:rFonts w:ascii="Arial" w:eastAsia="Times New Roman" w:hAnsi="Arial" w:cs="Arial"/>
-                <w:b/>
-                <w:bCs/>
-                <w:color w:val="000000"/>
-              </w:rPr>
-              <w:t>=0)</w:t>
+              <w:t>(random_state=0)</w:t>
             </w:r>
           </w:p>
         </w:tc>
@@ -2728,7 +2434,6 @@
                 <w:color w:val="000000"/>
               </w:rPr>
             </w:pPr>
-            <w:proofErr w:type="spellStart"/>
             <w:r>
               <w:rPr>
                 <w:rFonts w:ascii="Arial" w:eastAsia="Times New Roman" w:hAnsi="Arial" w:cs="Arial"/>
@@ -2736,7 +2441,6 @@
               </w:rPr>
               <w:t>squared_error</w:t>
             </w:r>
-            <w:proofErr w:type="spellEnd"/>
           </w:p>
         </w:tc>
         <w:tc>
@@ -2954,7 +2658,6 @@
                 <w:color w:val="000000"/>
               </w:rPr>
             </w:pPr>
-            <w:proofErr w:type="spellStart"/>
             <w:r>
               <w:rPr>
                 <w:rFonts w:ascii="Arial" w:eastAsia="Times New Roman" w:hAnsi="Arial" w:cs="Arial"/>
@@ -2962,7 +2665,6 @@
               </w:rPr>
               <w:t>friedman_mse</w:t>
             </w:r>
-            <w:proofErr w:type="spellEnd"/>
           </w:p>
         </w:tc>
         <w:tc>
@@ -3180,7 +2882,6 @@
                 <w:color w:val="000000"/>
               </w:rPr>
             </w:pPr>
-            <w:proofErr w:type="spellStart"/>
             <w:r>
               <w:rPr>
                 <w:rFonts w:ascii="Arial" w:eastAsia="Times New Roman" w:hAnsi="Arial" w:cs="Arial"/>
@@ -3188,7 +2889,6 @@
               </w:rPr>
               <w:t>absolute_error</w:t>
             </w:r>
-            <w:proofErr w:type="spellEnd"/>
           </w:p>
         </w:tc>
         <w:tc>
@@ -3406,7 +3106,6 @@
                 <w:color w:val="000000"/>
               </w:rPr>
             </w:pPr>
-            <w:proofErr w:type="spellStart"/>
             <w:r>
               <w:rPr>
                 <w:rFonts w:ascii="Arial" w:eastAsia="Times New Roman" w:hAnsi="Arial" w:cs="Arial"/>
@@ -3414,7 +3113,6 @@
               </w:rPr>
               <w:t>poisson</w:t>
             </w:r>
-            <w:proofErr w:type="spellEnd"/>
           </w:p>
         </w:tc>
         <w:tc>
@@ -3632,7 +3330,6 @@
                 <w:color w:val="000000"/>
               </w:rPr>
             </w:pPr>
-            <w:proofErr w:type="spellStart"/>
             <w:r>
               <w:rPr>
                 <w:rFonts w:ascii="Arial" w:eastAsia="Times New Roman" w:hAnsi="Arial" w:cs="Arial"/>
@@ -3640,7 +3337,6 @@
               </w:rPr>
               <w:t>squared_error</w:t>
             </w:r>
-            <w:proofErr w:type="spellEnd"/>
           </w:p>
         </w:tc>
         <w:tc>
@@ -3696,7 +3392,6 @@
                 <w:color w:val="000000"/>
               </w:rPr>
             </w:pPr>
-            <w:proofErr w:type="spellStart"/>
             <w:r>
               <w:rPr>
                 <w:rFonts w:ascii="Arial" w:eastAsia="Times New Roman" w:hAnsi="Arial" w:cs="Arial"/>
@@ -3704,7 +3399,6 @@
               </w:rPr>
               <w:t>sqrt</w:t>
             </w:r>
-            <w:proofErr w:type="spellEnd"/>
           </w:p>
         </w:tc>
         <w:tc>
@@ -3860,7 +3554,6 @@
                 <w:color w:val="000000"/>
               </w:rPr>
             </w:pPr>
-            <w:proofErr w:type="spellStart"/>
             <w:r>
               <w:rPr>
                 <w:rFonts w:ascii="Arial" w:eastAsia="Times New Roman" w:hAnsi="Arial" w:cs="Arial"/>
@@ -3868,7 +3561,6 @@
               </w:rPr>
               <w:t>friedman_mse</w:t>
             </w:r>
-            <w:proofErr w:type="spellEnd"/>
           </w:p>
         </w:tc>
         <w:tc>
@@ -3924,7 +3616,6 @@
                 <w:color w:val="000000"/>
               </w:rPr>
             </w:pPr>
-            <w:proofErr w:type="spellStart"/>
             <w:r>
               <w:rPr>
                 <w:rFonts w:ascii="Arial" w:eastAsia="Times New Roman" w:hAnsi="Arial" w:cs="Arial"/>
@@ -3932,7 +3623,6 @@
               </w:rPr>
               <w:t>sqrt</w:t>
             </w:r>
-            <w:proofErr w:type="spellEnd"/>
           </w:p>
         </w:tc>
         <w:tc>
@@ -4088,7 +3778,6 @@
                 <w:color w:val="000000"/>
               </w:rPr>
             </w:pPr>
-            <w:proofErr w:type="spellStart"/>
             <w:r>
               <w:rPr>
                 <w:rFonts w:ascii="Arial" w:eastAsia="Times New Roman" w:hAnsi="Arial" w:cs="Arial"/>
@@ -4096,7 +3785,6 @@
               </w:rPr>
               <w:t>absolute_error</w:t>
             </w:r>
-            <w:proofErr w:type="spellEnd"/>
           </w:p>
         </w:tc>
         <w:tc>
@@ -4152,7 +3840,6 @@
                 <w:color w:val="000000"/>
               </w:rPr>
             </w:pPr>
-            <w:proofErr w:type="spellStart"/>
             <w:r>
               <w:rPr>
                 <w:rFonts w:ascii="Arial" w:eastAsia="Times New Roman" w:hAnsi="Arial" w:cs="Arial"/>
@@ -4160,7 +3847,6 @@
               </w:rPr>
               <w:t>sqrt</w:t>
             </w:r>
-            <w:proofErr w:type="spellEnd"/>
           </w:p>
         </w:tc>
         <w:tc>
@@ -4320,7 +4006,6 @@
                 <w:color w:val="000000"/>
               </w:rPr>
             </w:pPr>
-            <w:proofErr w:type="spellStart"/>
             <w:r>
               <w:rPr>
                 <w:rFonts w:ascii="Arial" w:eastAsia="Times New Roman" w:hAnsi="Arial" w:cs="Arial"/>
@@ -4328,7 +4013,6 @@
               </w:rPr>
               <w:t>poisson</w:t>
             </w:r>
-            <w:proofErr w:type="spellEnd"/>
           </w:p>
         </w:tc>
         <w:tc>
@@ -4384,7 +4068,6 @@
                 <w:color w:val="000000"/>
               </w:rPr>
             </w:pPr>
-            <w:proofErr w:type="spellStart"/>
             <w:r>
               <w:rPr>
                 <w:rFonts w:ascii="Arial" w:eastAsia="Times New Roman" w:hAnsi="Arial" w:cs="Arial"/>
@@ -4392,7 +4075,6 @@
               </w:rPr>
               <w:t>sqrt</w:t>
             </w:r>
-            <w:proofErr w:type="spellEnd"/>
           </w:p>
         </w:tc>
         <w:tc>
@@ -4548,7 +4230,6 @@
                 <w:color w:val="000000"/>
               </w:rPr>
             </w:pPr>
-            <w:proofErr w:type="spellStart"/>
             <w:r>
               <w:rPr>
                 <w:rFonts w:ascii="Arial" w:eastAsia="Times New Roman" w:hAnsi="Arial" w:cs="Arial"/>
@@ -4556,7 +4237,6 @@
               </w:rPr>
               <w:t>squared_error</w:t>
             </w:r>
-            <w:proofErr w:type="spellEnd"/>
           </w:p>
         </w:tc>
         <w:tc>
@@ -4774,7 +4454,6 @@
                 <w:color w:val="000000"/>
               </w:rPr>
             </w:pPr>
-            <w:proofErr w:type="spellStart"/>
             <w:r>
               <w:rPr>
                 <w:rFonts w:ascii="Arial" w:eastAsia="Times New Roman" w:hAnsi="Arial" w:cs="Arial"/>
@@ -4782,7 +4461,6 @@
               </w:rPr>
               <w:t>friedman_mse</w:t>
             </w:r>
-            <w:proofErr w:type="spellEnd"/>
           </w:p>
         </w:tc>
         <w:tc>
@@ -5000,7 +4678,6 @@
                 <w:color w:val="000000"/>
               </w:rPr>
             </w:pPr>
-            <w:proofErr w:type="spellStart"/>
             <w:r>
               <w:rPr>
                 <w:rFonts w:ascii="Arial" w:eastAsia="Times New Roman" w:hAnsi="Arial" w:cs="Arial"/>
@@ -5008,7 +4685,6 @@
               </w:rPr>
               <w:t>absolute_error</w:t>
             </w:r>
-            <w:proofErr w:type="spellEnd"/>
           </w:p>
         </w:tc>
         <w:tc>
@@ -5231,7 +4907,6 @@
                 <w:color w:val="000000"/>
               </w:rPr>
             </w:pPr>
-            <w:proofErr w:type="spellStart"/>
             <w:r>
               <w:rPr>
                 <w:rFonts w:ascii="Arial" w:eastAsia="Times New Roman" w:hAnsi="Arial" w:cs="Arial"/>
@@ -5239,7 +4914,6 @@
               </w:rPr>
               <w:t>poisson</w:t>
             </w:r>
-            <w:proofErr w:type="spellEnd"/>
           </w:p>
         </w:tc>
         <w:tc>
@@ -5457,7 +5131,6 @@
                 <w:color w:val="000000"/>
               </w:rPr>
             </w:pPr>
-            <w:proofErr w:type="spellStart"/>
             <w:r>
               <w:rPr>
                 <w:rFonts w:ascii="Arial" w:eastAsia="Times New Roman" w:hAnsi="Arial" w:cs="Arial"/>
@@ -5465,7 +5138,6 @@
               </w:rPr>
               <w:t>squared_error</w:t>
             </w:r>
-            <w:proofErr w:type="spellEnd"/>
           </w:p>
         </w:tc>
         <w:tc>
@@ -5683,7 +5355,6 @@
                 <w:color w:val="000000"/>
               </w:rPr>
             </w:pPr>
-            <w:proofErr w:type="spellStart"/>
             <w:r>
               <w:rPr>
                 <w:rFonts w:ascii="Arial" w:eastAsia="Times New Roman" w:hAnsi="Arial" w:cs="Arial"/>
@@ -5691,7 +5362,6 @@
               </w:rPr>
               <w:t>friedman_mse</w:t>
             </w:r>
-            <w:proofErr w:type="spellEnd"/>
           </w:p>
         </w:tc>
         <w:tc>
@@ -5909,7 +5579,6 @@
                 <w:color w:val="000000"/>
               </w:rPr>
             </w:pPr>
-            <w:proofErr w:type="spellStart"/>
             <w:r>
               <w:rPr>
                 <w:rFonts w:ascii="Arial" w:eastAsia="Times New Roman" w:hAnsi="Arial" w:cs="Arial"/>
@@ -5917,7 +5586,6 @@
               </w:rPr>
               <w:t>absolute_error</w:t>
             </w:r>
-            <w:proofErr w:type="spellEnd"/>
           </w:p>
         </w:tc>
         <w:tc>
@@ -6139,7 +5807,6 @@
                 <w:color w:val="000000"/>
               </w:rPr>
             </w:pPr>
-            <w:proofErr w:type="spellStart"/>
             <w:r>
               <w:rPr>
                 <w:rFonts w:ascii="Arial" w:eastAsia="Times New Roman" w:hAnsi="Arial" w:cs="Arial"/>
@@ -6147,7 +5814,6 @@
               </w:rPr>
               <w:t>poisson</w:t>
             </w:r>
-            <w:proofErr w:type="spellEnd"/>
           </w:p>
         </w:tc>
         <w:tc>
@@ -6365,7 +6031,6 @@
                 <w:color w:val="000000"/>
               </w:rPr>
             </w:pPr>
-            <w:proofErr w:type="spellStart"/>
             <w:r>
               <w:rPr>
                 <w:rFonts w:ascii="Arial" w:eastAsia="Times New Roman" w:hAnsi="Arial" w:cs="Arial"/>
@@ -6373,7 +6038,6 @@
               </w:rPr>
               <w:t>squared_error</w:t>
             </w:r>
-            <w:proofErr w:type="spellEnd"/>
           </w:p>
         </w:tc>
         <w:tc>
@@ -6429,7 +6093,6 @@
                 <w:color w:val="000000"/>
               </w:rPr>
             </w:pPr>
-            <w:proofErr w:type="spellStart"/>
             <w:r>
               <w:rPr>
                 <w:rFonts w:ascii="Arial" w:eastAsia="Times New Roman" w:hAnsi="Arial" w:cs="Arial"/>
@@ -6437,7 +6100,6 @@
               </w:rPr>
               <w:t>sqrt</w:t>
             </w:r>
-            <w:proofErr w:type="spellEnd"/>
           </w:p>
         </w:tc>
         <w:tc>
@@ -6593,7 +6255,6 @@
                 <w:color w:val="000000"/>
               </w:rPr>
             </w:pPr>
-            <w:proofErr w:type="spellStart"/>
             <w:r>
               <w:rPr>
                 <w:rFonts w:ascii="Arial" w:eastAsia="Times New Roman" w:hAnsi="Arial" w:cs="Arial"/>
@@ -6601,7 +6262,6 @@
               </w:rPr>
               <w:t>friedman_mse</w:t>
             </w:r>
-            <w:proofErr w:type="spellEnd"/>
           </w:p>
         </w:tc>
         <w:tc>
@@ -6657,7 +6317,6 @@
                 <w:color w:val="000000"/>
               </w:rPr>
             </w:pPr>
-            <w:proofErr w:type="spellStart"/>
             <w:r>
               <w:rPr>
                 <w:rFonts w:ascii="Arial" w:eastAsia="Times New Roman" w:hAnsi="Arial" w:cs="Arial"/>
@@ -6665,7 +6324,6 @@
               </w:rPr>
               <w:t>sqrt</w:t>
             </w:r>
-            <w:proofErr w:type="spellEnd"/>
           </w:p>
         </w:tc>
         <w:tc>
@@ -6821,7 +6479,6 @@
                 <w:color w:val="000000"/>
               </w:rPr>
             </w:pPr>
-            <w:proofErr w:type="spellStart"/>
             <w:r>
               <w:rPr>
                 <w:rFonts w:ascii="Arial" w:eastAsia="Times New Roman" w:hAnsi="Arial" w:cs="Arial"/>
@@ -6829,7 +6486,6 @@
               </w:rPr>
               <w:t>absolute_error</w:t>
             </w:r>
-            <w:proofErr w:type="spellEnd"/>
           </w:p>
         </w:tc>
         <w:tc>
@@ -6885,7 +6541,6 @@
                 <w:color w:val="000000"/>
               </w:rPr>
             </w:pPr>
-            <w:proofErr w:type="spellStart"/>
             <w:r>
               <w:rPr>
                 <w:rFonts w:ascii="Arial" w:eastAsia="Times New Roman" w:hAnsi="Arial" w:cs="Arial"/>
@@ -6893,7 +6548,6 @@
               </w:rPr>
               <w:t>sqrt</w:t>
             </w:r>
-            <w:proofErr w:type="spellEnd"/>
           </w:p>
         </w:tc>
         <w:tc>
@@ -7049,7 +6703,6 @@
                 <w:color w:val="000000"/>
               </w:rPr>
             </w:pPr>
-            <w:proofErr w:type="spellStart"/>
             <w:r>
               <w:rPr>
                 <w:rFonts w:ascii="Arial" w:eastAsia="Times New Roman" w:hAnsi="Arial" w:cs="Arial"/>
@@ -7057,7 +6710,6 @@
               </w:rPr>
               <w:t>poisson</w:t>
             </w:r>
-            <w:proofErr w:type="spellEnd"/>
           </w:p>
         </w:tc>
         <w:tc>
@@ -7113,7 +6765,6 @@
                 <w:color w:val="000000"/>
               </w:rPr>
             </w:pPr>
-            <w:proofErr w:type="spellStart"/>
             <w:r>
               <w:rPr>
                 <w:rFonts w:ascii="Arial" w:eastAsia="Times New Roman" w:hAnsi="Arial" w:cs="Arial"/>
@@ -7121,7 +6772,6 @@
               </w:rPr>
               <w:t>sqrt</w:t>
             </w:r>
-            <w:proofErr w:type="spellEnd"/>
           </w:p>
         </w:tc>
         <w:tc>
@@ -7277,7 +6927,6 @@
                 <w:color w:val="000000"/>
               </w:rPr>
             </w:pPr>
-            <w:proofErr w:type="spellStart"/>
             <w:r>
               <w:rPr>
                 <w:rFonts w:ascii="Arial" w:eastAsia="Times New Roman" w:hAnsi="Arial" w:cs="Arial"/>
@@ -7285,7 +6934,6 @@
               </w:rPr>
               <w:t>squared_error</w:t>
             </w:r>
-            <w:proofErr w:type="spellEnd"/>
           </w:p>
         </w:tc>
         <w:tc>
@@ -7503,7 +7151,6 @@
                 <w:color w:val="000000"/>
               </w:rPr>
             </w:pPr>
-            <w:proofErr w:type="spellStart"/>
             <w:r>
               <w:rPr>
                 <w:rFonts w:ascii="Arial" w:eastAsia="Times New Roman" w:hAnsi="Arial" w:cs="Arial"/>
@@ -7511,7 +7158,6 @@
               </w:rPr>
               <w:t>friedman_mse</w:t>
             </w:r>
-            <w:proofErr w:type="spellEnd"/>
           </w:p>
         </w:tc>
         <w:tc>
@@ -7729,7 +7375,6 @@
                 <w:color w:val="000000"/>
               </w:rPr>
             </w:pPr>
-            <w:proofErr w:type="spellStart"/>
             <w:r>
               <w:rPr>
                 <w:rFonts w:ascii="Arial" w:eastAsia="Times New Roman" w:hAnsi="Arial" w:cs="Arial"/>
@@ -7737,7 +7382,6 @@
               </w:rPr>
               <w:t>absolute_error</w:t>
             </w:r>
-            <w:proofErr w:type="spellEnd"/>
           </w:p>
         </w:tc>
         <w:tc>
@@ -7955,7 +7599,6 @@
                 <w:color w:val="000000"/>
               </w:rPr>
             </w:pPr>
-            <w:proofErr w:type="spellStart"/>
             <w:r>
               <w:rPr>
                 <w:rFonts w:ascii="Arial" w:eastAsia="Times New Roman" w:hAnsi="Arial" w:cs="Arial"/>
@@ -7963,7 +7606,6 @@
               </w:rPr>
               <w:t>poisson</w:t>
             </w:r>
-            <w:proofErr w:type="spellEnd"/>
           </w:p>
         </w:tc>
         <w:tc>
@@ -8181,72 +7823,31 @@
           <w:sz w:val="24"/>
           <w:szCs w:val="24"/>
         </w:rPr>
-        <w:t xml:space="preserve">I tried to improve the model using a Random Forest </w:t>
+        <w:t xml:space="preserve">I tried to improve the model using a Random Forest Regressor by tuning the hyperparameters </w:t>
       </w:r>
-      <w:proofErr w:type="spellStart"/>
-      <w:r>
+    </w:p>
+    <w:p>
+      <w:pPr>
+        <w:pStyle w:val="ListParagraph"/>
+        <w:spacing w:before="100" w:beforeAutospacing="1" w:after="100" w:afterAutospacing="1" w:line="240" w:lineRule="auto"/>
+        <w:rPr>
+          <w:rFonts w:ascii="Arial" w:eastAsia="Times New Roman" w:hAnsi="Arial" w:cs="Arial"/>
+          <w:sz w:val="24"/>
+          <w:szCs w:val="24"/>
+        </w:rPr>
+      </w:pPr>
+    </w:p>
+    <w:p>
+      <w:pPr>
+        <w:pStyle w:val="ListParagraph"/>
+        <w:spacing w:before="100" w:beforeAutospacing="1" w:after="100" w:afterAutospacing="1" w:line="240" w:lineRule="auto"/>
         <w:rPr>
           <w:rFonts w:ascii="Arial" w:eastAsia="Times New Roman" w:hAnsi="Arial" w:cs="Arial"/>
           <w:iCs/>
           <w:sz w:val="24"/>
           <w:szCs w:val="24"/>
         </w:rPr>
-        <w:t>Regressor</w:t>
-      </w:r>
-      <w:proofErr w:type="spellEnd"/>
-      <w:r>
-        <w:rPr>
-          <w:rFonts w:ascii="Arial" w:eastAsia="Times New Roman" w:hAnsi="Arial" w:cs="Arial"/>
-          <w:iCs/>
-          <w:sz w:val="24"/>
-          <w:szCs w:val="24"/>
-        </w:rPr>
-        <w:t xml:space="preserve"> by tuning the </w:t>
-      </w:r>
-      <w:proofErr w:type="spellStart"/>
-      <w:r>
-        <w:rPr>
-          <w:rFonts w:ascii="Arial" w:eastAsia="Times New Roman" w:hAnsi="Arial" w:cs="Arial"/>
-          <w:iCs/>
-          <w:sz w:val="24"/>
-          <w:szCs w:val="24"/>
-        </w:rPr>
-        <w:t>hyperparameters</w:t>
-      </w:r>
-      <w:proofErr w:type="spellEnd"/>
-      <w:r>
-        <w:rPr>
-          <w:rFonts w:ascii="Arial" w:eastAsia="Times New Roman" w:hAnsi="Arial" w:cs="Arial"/>
-          <w:iCs/>
-          <w:sz w:val="24"/>
-          <w:szCs w:val="24"/>
-        </w:rPr>
-        <w:t xml:space="preserve"> </w:t>
-      </w:r>
-    </w:p>
-    <w:p>
-      <w:pPr>
-        <w:pStyle w:val="ListParagraph"/>
-        <w:spacing w:before="100" w:beforeAutospacing="1" w:after="100" w:afterAutospacing="1" w:line="240" w:lineRule="auto"/>
-        <w:rPr>
-          <w:rFonts w:ascii="Arial" w:eastAsia="Times New Roman" w:hAnsi="Arial" w:cs="Arial"/>
-          <w:sz w:val="24"/>
-          <w:szCs w:val="24"/>
-        </w:rPr>
-      </w:pPr>
-    </w:p>
-    <w:p>
-      <w:pPr>
-        <w:pStyle w:val="ListParagraph"/>
-        <w:spacing w:before="100" w:beforeAutospacing="1" w:after="100" w:afterAutospacing="1" w:line="240" w:lineRule="auto"/>
-        <w:rPr>
-          <w:rFonts w:ascii="Arial" w:eastAsia="Times New Roman" w:hAnsi="Arial" w:cs="Arial"/>
-          <w:iCs/>
-          <w:sz w:val="24"/>
-          <w:szCs w:val="24"/>
-        </w:rPr>
-      </w:pPr>
-      <w:proofErr w:type="spellStart"/>
+      </w:pPr>
       <w:r>
         <w:rPr>
           <w:rFonts w:ascii="Arial" w:eastAsia="Times New Roman" w:hAnsi="Arial" w:cs="Arial"/>
@@ -8258,7 +7859,6 @@
         </w:rPr>
         <w:t>n_estimators</w:t>
       </w:r>
-      <w:proofErr w:type="spellEnd"/>
       <w:r>
         <w:rPr>
           <w:rFonts w:ascii="Arial" w:eastAsia="Times New Roman" w:hAnsi="Arial" w:cs="Arial"/>
@@ -8280,7 +7880,6 @@
           <w:szCs w:val="24"/>
         </w:rPr>
       </w:pPr>
-      <w:proofErr w:type="gramStart"/>
       <w:r>
         <w:rPr>
           <w:rFonts w:ascii="Arial" w:eastAsia="Times New Roman" w:hAnsi="Arial" w:cs="Arial"/>
@@ -8292,7 +7891,6 @@
         </w:rPr>
         <w:t>criterion</w:t>
       </w:r>
-      <w:proofErr w:type="gramEnd"/>
       <w:r>
         <w:rPr>
           <w:rFonts w:ascii="Arial" w:eastAsia="Times New Roman" w:hAnsi="Arial" w:cs="Arial"/>
@@ -8300,89 +7898,8 @@
           <w:sz w:val="24"/>
           <w:szCs w:val="24"/>
         </w:rPr>
-        <w:t xml:space="preserve"> {"</w:t>
+        <w:t xml:space="preserve"> {"squared_error", "friedman_mse", "absolute_error", "poisson"}, and </w:t>
       </w:r>
-      <w:proofErr w:type="spellStart"/>
-      <w:r>
-        <w:rPr>
-          <w:rFonts w:ascii="Arial" w:eastAsia="Times New Roman" w:hAnsi="Arial" w:cs="Arial"/>
-          <w:iCs/>
-          <w:sz w:val="24"/>
-          <w:szCs w:val="24"/>
-        </w:rPr>
-        <w:t>squared_error</w:t>
-      </w:r>
-      <w:proofErr w:type="spellEnd"/>
-      <w:r>
-        <w:rPr>
-          <w:rFonts w:ascii="Arial" w:eastAsia="Times New Roman" w:hAnsi="Arial" w:cs="Arial"/>
-          <w:iCs/>
-          <w:sz w:val="24"/>
-          <w:szCs w:val="24"/>
-        </w:rPr>
-        <w:t>", "</w:t>
-      </w:r>
-      <w:proofErr w:type="spellStart"/>
-      <w:r>
-        <w:rPr>
-          <w:rFonts w:ascii="Arial" w:eastAsia="Times New Roman" w:hAnsi="Arial" w:cs="Arial"/>
-          <w:iCs/>
-          <w:sz w:val="24"/>
-          <w:szCs w:val="24"/>
-        </w:rPr>
-        <w:t>friedman_mse</w:t>
-      </w:r>
-      <w:proofErr w:type="spellEnd"/>
-      <w:r>
-        <w:rPr>
-          <w:rFonts w:ascii="Arial" w:eastAsia="Times New Roman" w:hAnsi="Arial" w:cs="Arial"/>
-          <w:iCs/>
-          <w:sz w:val="24"/>
-          <w:szCs w:val="24"/>
-        </w:rPr>
-        <w:t>", "</w:t>
-      </w:r>
-      <w:proofErr w:type="spellStart"/>
-      <w:r>
-        <w:rPr>
-          <w:rFonts w:ascii="Arial" w:eastAsia="Times New Roman" w:hAnsi="Arial" w:cs="Arial"/>
-          <w:iCs/>
-          <w:sz w:val="24"/>
-          <w:szCs w:val="24"/>
-        </w:rPr>
-        <w:t>absolute_error</w:t>
-      </w:r>
-      <w:proofErr w:type="spellEnd"/>
-      <w:r>
-        <w:rPr>
-          <w:rFonts w:ascii="Arial" w:eastAsia="Times New Roman" w:hAnsi="Arial" w:cs="Arial"/>
-          <w:iCs/>
-          <w:sz w:val="24"/>
-          <w:szCs w:val="24"/>
-        </w:rPr>
-        <w:t>", "</w:t>
-      </w:r>
-      <w:proofErr w:type="spellStart"/>
-      <w:r>
-        <w:rPr>
-          <w:rFonts w:ascii="Arial" w:eastAsia="Times New Roman" w:hAnsi="Arial" w:cs="Arial"/>
-          <w:iCs/>
-          <w:sz w:val="24"/>
-          <w:szCs w:val="24"/>
-        </w:rPr>
-        <w:t>poisson</w:t>
-      </w:r>
-      <w:proofErr w:type="spellEnd"/>
-      <w:r>
-        <w:rPr>
-          <w:rFonts w:ascii="Arial" w:eastAsia="Times New Roman" w:hAnsi="Arial" w:cs="Arial"/>
-          <w:iCs/>
-          <w:sz w:val="24"/>
-          <w:szCs w:val="24"/>
-        </w:rPr>
-        <w:t xml:space="preserve">"}, and </w:t>
-      </w:r>
-      <w:proofErr w:type="spellStart"/>
       <w:r>
         <w:rPr>
           <w:rFonts w:ascii="Arial" w:eastAsia="Times New Roman" w:hAnsi="Arial" w:cs="Arial"/>
@@ -8392,19 +7909,7 @@
           <w:sz w:val="24"/>
           <w:szCs w:val="24"/>
         </w:rPr>
-        <w:t>random_state</w:t>
-      </w:r>
-      <w:proofErr w:type="spellEnd"/>
-      <w:r>
-        <w:rPr>
-          <w:rFonts w:ascii="Arial" w:eastAsia="Times New Roman" w:hAnsi="Arial" w:cs="Arial"/>
-          <w:b/>
-          <w:bCs/>
-          <w:iCs/>
-          <w:sz w:val="24"/>
-          <w:szCs w:val="24"/>
-        </w:rPr>
-        <w:t xml:space="preserve"> = 0</w:t>
+        <w:t>random_state = 0</w:t>
       </w:r>
       <w:r>
         <w:rPr>
@@ -8464,7 +7969,6 @@
           <w:szCs w:val="24"/>
         </w:rPr>
       </w:pPr>
-      <w:proofErr w:type="spellStart"/>
       <w:r>
         <w:rPr>
           <w:rFonts w:ascii="Arial" w:eastAsia="Times New Roman" w:hAnsi="Arial" w:cs="Arial"/>
@@ -8472,17 +7976,7 @@
           <w:sz w:val="24"/>
           <w:szCs w:val="24"/>
         </w:rPr>
-        <w:t>n_estimators</w:t>
-      </w:r>
-      <w:proofErr w:type="spellEnd"/>
-      <w:r>
-        <w:rPr>
-          <w:rFonts w:ascii="Arial" w:eastAsia="Times New Roman" w:hAnsi="Arial" w:cs="Arial"/>
-          <w:iCs/>
-          <w:sz w:val="24"/>
-          <w:szCs w:val="24"/>
-        </w:rPr>
-        <w:t xml:space="preserve"> = 100</w:t>
+        <w:t>n_estimators = 100</w:t>
       </w:r>
     </w:p>
     <w:p>
@@ -8505,27 +7999,7 @@
           <w:sz w:val="24"/>
           <w:szCs w:val="24"/>
         </w:rPr>
-        <w:t>criterion = "</w:t>
-      </w:r>
-      <w:proofErr w:type="spellStart"/>
-      <w:r>
-        <w:rPr>
-          <w:rFonts w:ascii="Arial" w:eastAsia="Times New Roman" w:hAnsi="Arial" w:cs="Arial"/>
-          <w:iCs/>
-          <w:sz w:val="24"/>
-          <w:szCs w:val="24"/>
-        </w:rPr>
-        <w:t>poisson</w:t>
-      </w:r>
-      <w:proofErr w:type="spellEnd"/>
-      <w:r>
-        <w:rPr>
-          <w:rFonts w:ascii="Arial" w:eastAsia="Times New Roman" w:hAnsi="Arial" w:cs="Arial"/>
-          <w:iCs/>
-          <w:sz w:val="24"/>
-          <w:szCs w:val="24"/>
-        </w:rPr>
-        <w:t>"</w:t>
+        <w:t>criterion = "poisson"</w:t>
       </w:r>
     </w:p>
     <w:p>
@@ -8541,7 +8015,6 @@
           <w:szCs w:val="24"/>
         </w:rPr>
       </w:pPr>
-      <w:proofErr w:type="spellStart"/>
       <w:r>
         <w:rPr>
           <w:rFonts w:ascii="Arial" w:eastAsia="Times New Roman" w:hAnsi="Arial" w:cs="Arial"/>
@@ -8549,17 +8022,7 @@
           <w:sz w:val="24"/>
           <w:szCs w:val="24"/>
         </w:rPr>
-        <w:t>random_state</w:t>
-      </w:r>
-      <w:proofErr w:type="spellEnd"/>
-      <w:r>
-        <w:rPr>
-          <w:rFonts w:ascii="Arial" w:eastAsia="Times New Roman" w:hAnsi="Arial" w:cs="Arial"/>
-          <w:iCs/>
-          <w:sz w:val="24"/>
-          <w:szCs w:val="24"/>
-        </w:rPr>
-        <w:t xml:space="preserve"> = 0</w:t>
+        <w:t>random_state = 0</w:t>
       </w:r>
     </w:p>
     <w:p>
@@ -8854,7 +8317,6 @@
                 <w:color w:val="000000"/>
               </w:rPr>
             </w:pPr>
-            <w:proofErr w:type="spellStart"/>
             <w:r>
               <w:rPr>
                 <w:rFonts w:ascii="Arial" w:eastAsia="Times New Roman" w:hAnsi="Arial" w:cs="Arial"/>
@@ -8864,7 +8326,6 @@
               </w:rPr>
               <w:t>random_state</w:t>
             </w:r>
-            <w:proofErr w:type="spellEnd"/>
           </w:p>
         </w:tc>
         <w:tc>
@@ -8891,7 +8352,6 @@
                 <w:color w:val="000000"/>
               </w:rPr>
             </w:pPr>
-            <w:proofErr w:type="spellStart"/>
             <w:r>
               <w:rPr>
                 <w:rFonts w:ascii="Arial" w:eastAsia="Times New Roman" w:hAnsi="Arial" w:cs="Arial"/>
@@ -8901,7 +8361,6 @@
               </w:rPr>
               <w:t>n_estimators</w:t>
             </w:r>
-            <w:proofErr w:type="spellEnd"/>
           </w:p>
         </w:tc>
         <w:tc>
@@ -9720,7 +9179,6 @@
                 <w:color w:val="000000"/>
               </w:rPr>
             </w:pPr>
-            <w:proofErr w:type="spellStart"/>
             <w:r>
               <w:rPr>
                 <w:rFonts w:ascii="Arial" w:eastAsia="Times New Roman" w:hAnsi="Arial" w:cs="Arial"/>
@@ -9728,7 +9186,6 @@
               </w:rPr>
               <w:t>squared_error</w:t>
             </w:r>
-            <w:proofErr w:type="spellEnd"/>
           </w:p>
         </w:tc>
         <w:tc>
@@ -9918,7 +9375,6 @@
                 <w:color w:val="000000"/>
               </w:rPr>
             </w:pPr>
-            <w:proofErr w:type="spellStart"/>
             <w:r>
               <w:rPr>
                 <w:rFonts w:ascii="Arial" w:eastAsia="Times New Roman" w:hAnsi="Arial" w:cs="Arial"/>
@@ -9926,7 +9382,6 @@
               </w:rPr>
               <w:t>friedman_mse</w:t>
             </w:r>
-            <w:proofErr w:type="spellEnd"/>
           </w:p>
         </w:tc>
         <w:tc>
@@ -10116,7 +9571,6 @@
                 <w:color w:val="000000"/>
               </w:rPr>
             </w:pPr>
-            <w:proofErr w:type="spellStart"/>
             <w:r>
               <w:rPr>
                 <w:rFonts w:ascii="Arial" w:eastAsia="Times New Roman" w:hAnsi="Arial" w:cs="Arial"/>
@@ -10124,7 +9578,6 @@
               </w:rPr>
               <w:t>absolute_error</w:t>
             </w:r>
-            <w:proofErr w:type="spellEnd"/>
           </w:p>
         </w:tc>
         <w:tc>
@@ -10320,7 +9773,6 @@
                 <w:color w:val="000000"/>
               </w:rPr>
             </w:pPr>
-            <w:proofErr w:type="spellStart"/>
             <w:r>
               <w:rPr>
                 <w:rFonts w:ascii="Arial" w:eastAsia="Times New Roman" w:hAnsi="Arial" w:cs="Arial"/>
@@ -10330,7 +9782,6 @@
               </w:rPr>
               <w:t>poisson</w:t>
             </w:r>
-            <w:proofErr w:type="spellEnd"/>
           </w:p>
         </w:tc>
         <w:tc>
@@ -10452,60 +9903,24 @@
           <w:rFonts w:ascii="Arial" w:hAnsi="Arial" w:cs="Arial"/>
           <w:i w:val="0"/>
         </w:rPr>
-        <w:t xml:space="preserve">The final model is the Random Forest </w:t>
+        <w:t>The final model is the Random Forest Regressor, as it achieved higher accuracy compared to the other algorithms. Therefore, I conclude that this model performs well for the given problem statement—insurance charges prediction.</w:t>
       </w:r>
-      <w:proofErr w:type="spellStart"/>
+    </w:p>
+    <w:p>
+      <w:pPr>
+        <w:pStyle w:val="NormalWeb"/>
+        <w:rPr>
+          <w:rFonts w:ascii="Arial" w:hAnsi="Arial" w:cs="Arial"/>
+          <w:i/>
+        </w:rPr>
+      </w:pPr>
       <w:r>
         <w:rPr>
           <w:rStyle w:val="Emphasis"/>
           <w:rFonts w:ascii="Arial" w:hAnsi="Arial" w:cs="Arial"/>
           <w:i w:val="0"/>
         </w:rPr>
-        <w:t>Regressor</w:t>
-      </w:r>
-      <w:proofErr w:type="spellEnd"/>
-      <w:r>
-        <w:rPr>
-          <w:rStyle w:val="Emphasis"/>
-          <w:rFonts w:ascii="Arial" w:hAnsi="Arial" w:cs="Arial"/>
-          <w:i w:val="0"/>
-        </w:rPr>
-        <w:t>, as it achieved higher accuracy compared to the other algorithms. Therefore, I conclude that this model performs well for the given problem statement—insurance charges prediction.</w:t>
-      </w:r>
-    </w:p>
-    <w:p>
-      <w:pPr>
-        <w:pStyle w:val="NormalWeb"/>
-        <w:rPr>
-          <w:rFonts w:ascii="Arial" w:hAnsi="Arial" w:cs="Arial"/>
-          <w:i/>
-        </w:rPr>
-      </w:pPr>
-      <w:r>
-        <w:rPr>
-          <w:rStyle w:val="Emphasis"/>
-          <w:rFonts w:ascii="Arial" w:hAnsi="Arial" w:cs="Arial"/>
-          <w:i w:val="0"/>
-        </w:rPr>
-        <w:t xml:space="preserve">I am finalizing the Random Forest model because, after evaluating multiple algorithms (MLR, SVM - SVR, Decision Tree, and Random Forest </w:t>
-      </w:r>
-      <w:proofErr w:type="spellStart"/>
-      <w:r>
-        <w:rPr>
-          <w:rStyle w:val="Emphasis"/>
-          <w:rFonts w:ascii="Arial" w:hAnsi="Arial" w:cs="Arial"/>
-          <w:i w:val="0"/>
-        </w:rPr>
-        <w:t>Regressor</w:t>
-      </w:r>
-      <w:proofErr w:type="spellEnd"/>
-      <w:r>
-        <w:rPr>
-          <w:rStyle w:val="Emphasis"/>
-          <w:rFonts w:ascii="Arial" w:hAnsi="Arial" w:cs="Arial"/>
-          <w:i w:val="0"/>
-        </w:rPr>
-        <w:t xml:space="preserve">), </w:t>
+        <w:t xml:space="preserve">I am finalizing the Random Forest model because, after evaluating multiple algorithms (MLR, SVM - SVR, Decision Tree, and Random Forest Regressor), </w:t>
       </w:r>
       <w:r>
         <w:rPr>
@@ -10514,27 +9929,7 @@
           <w:i w:val="0"/>
           <w:highlight w:val="green"/>
         </w:rPr>
-        <w:t xml:space="preserve">the Random Forest </w:t>
-      </w:r>
-      <w:proofErr w:type="spellStart"/>
-      <w:r>
-        <w:rPr>
-          <w:rStyle w:val="Emphasis"/>
-          <w:rFonts w:ascii="Arial" w:hAnsi="Arial" w:cs="Arial"/>
-          <w:i w:val="0"/>
-          <w:highlight w:val="green"/>
-        </w:rPr>
-        <w:t>Regressor</w:t>
-      </w:r>
-      <w:proofErr w:type="spellEnd"/>
-      <w:r>
-        <w:rPr>
-          <w:rStyle w:val="Emphasis"/>
-          <w:rFonts w:ascii="Arial" w:hAnsi="Arial" w:cs="Arial"/>
-          <w:i w:val="0"/>
-          <w:highlight w:val="green"/>
-        </w:rPr>
-        <w:t xml:space="preserve"> produced the best accuracy of </w:t>
+        <w:t xml:space="preserve">the Random Forest Regressor produced the best accuracy of </w:t>
       </w:r>
       <w:r>
         <w:rPr>
@@ -10890,7 +10285,6 @@
                 <w:color w:val="000000"/>
               </w:rPr>
             </w:pPr>
-            <w:proofErr w:type="spellStart"/>
             <w:r>
               <w:rPr>
                 <w:rFonts w:ascii="Calibri" w:eastAsia="Times New Roman" w:hAnsi="Calibri" w:cs="Calibri"/>
@@ -10900,7 +10294,6 @@
               </w:rPr>
               <w:t>n_estimators</w:t>
             </w:r>
-            <w:proofErr w:type="spellEnd"/>
           </w:p>
         </w:tc>
         <w:tc>
@@ -10927,7 +10320,6 @@
                 <w:color w:val="000000"/>
               </w:rPr>
             </w:pPr>
-            <w:proofErr w:type="spellStart"/>
             <w:r>
               <w:rPr>
                 <w:rFonts w:ascii="Calibri" w:eastAsia="Times New Roman" w:hAnsi="Calibri" w:cs="Calibri"/>
@@ -10937,7 +10329,6 @@
               </w:rPr>
               <w:t>learning_rate</w:t>
             </w:r>
-            <w:proofErr w:type="spellEnd"/>
           </w:p>
         </w:tc>
         <w:tc>
@@ -11105,37 +10496,12 @@
                 <w:color w:val="000000"/>
               </w:rPr>
             </w:pPr>
-            <w:proofErr w:type="spellStart"/>
-            <w:r>
-              <w:rPr>
-                <w:rFonts w:ascii="Calibri" w:eastAsia="Times New Roman" w:hAnsi="Calibri" w:cs="Calibri"/>
-                <w:color w:val="000000"/>
-              </w:rPr>
-              <w:t>DecisionTreeRegressor</w:t>
-            </w:r>
-            <w:proofErr w:type="spellEnd"/>
-            <w:r>
-              <w:rPr>
-                <w:rFonts w:ascii="Calibri" w:eastAsia="Times New Roman" w:hAnsi="Calibri" w:cs="Calibri"/>
-                <w:color w:val="000000"/>
-              </w:rPr>
-              <w:t>(</w:t>
-            </w:r>
-            <w:proofErr w:type="spellStart"/>
-            <w:r>
-              <w:rPr>
-                <w:rFonts w:ascii="Calibri" w:eastAsia="Times New Roman" w:hAnsi="Calibri" w:cs="Calibri"/>
-                <w:color w:val="000000"/>
-              </w:rPr>
-              <w:t>max_depth</w:t>
-            </w:r>
-            <w:proofErr w:type="spellEnd"/>
-            <w:r>
-              <w:rPr>
-                <w:rFonts w:ascii="Calibri" w:eastAsia="Times New Roman" w:hAnsi="Calibri" w:cs="Calibri"/>
-                <w:color w:val="000000"/>
-              </w:rPr>
-              <w:t>=3)</w:t>
+            <w:r>
+              <w:rPr>
+                <w:rFonts w:ascii="Calibri" w:eastAsia="Times New Roman" w:hAnsi="Calibri" w:cs="Calibri"/>
+                <w:color w:val="000000"/>
+              </w:rPr>
+              <w:t>DecisionTreeRegressor(max_depth=3)</w:t>
             </w:r>
           </w:p>
         </w:tc>
@@ -13638,103 +13004,12 @@
       <w:r>
         <w:t xml:space="preserve"> </w:t>
       </w:r>
-      <w:proofErr w:type="spellStart"/>
-      <w:proofErr w:type="gramStart"/>
       <w:r>
         <w:rPr>
           <w:rStyle w:val="HTMLCode"/>
           <w:rFonts w:eastAsiaTheme="minorHAnsi"/>
         </w:rPr>
-        <w:t>AdaBoostRegressor</w:t>
-      </w:r>
-      <w:proofErr w:type="spellEnd"/>
-      <w:r>
-        <w:rPr>
-          <w:rStyle w:val="HTMLCode"/>
-          <w:rFonts w:eastAsiaTheme="minorHAnsi"/>
-        </w:rPr>
-        <w:t>(</w:t>
-      </w:r>
-      <w:proofErr w:type="spellStart"/>
-      <w:proofErr w:type="gramEnd"/>
-      <w:r>
-        <w:rPr>
-          <w:rStyle w:val="HTMLCode"/>
-          <w:rFonts w:eastAsiaTheme="minorHAnsi"/>
-        </w:rPr>
-        <w:t>random_state</w:t>
-      </w:r>
-      <w:proofErr w:type="spellEnd"/>
-      <w:r>
-        <w:rPr>
-          <w:rStyle w:val="HTMLCode"/>
-          <w:rFonts w:eastAsiaTheme="minorHAnsi"/>
-        </w:rPr>
-        <w:t>=0, estimator=</w:t>
-      </w:r>
-      <w:proofErr w:type="spellStart"/>
-      <w:r>
-        <w:rPr>
-          <w:rStyle w:val="HTMLCode"/>
-          <w:rFonts w:eastAsiaTheme="minorHAnsi"/>
-        </w:rPr>
-        <w:t>DecisionTreeRegressor</w:t>
-      </w:r>
-      <w:proofErr w:type="spellEnd"/>
-      <w:r>
-        <w:rPr>
-          <w:rStyle w:val="HTMLCode"/>
-          <w:rFonts w:eastAsiaTheme="minorHAnsi"/>
-        </w:rPr>
-        <w:t>(</w:t>
-      </w:r>
-      <w:proofErr w:type="spellStart"/>
-      <w:r>
-        <w:rPr>
-          <w:rStyle w:val="HTMLCode"/>
-          <w:rFonts w:eastAsiaTheme="minorHAnsi"/>
-        </w:rPr>
-        <w:t>max_depth</w:t>
-      </w:r>
-      <w:proofErr w:type="spellEnd"/>
-      <w:r>
-        <w:rPr>
-          <w:rStyle w:val="HTMLCode"/>
-          <w:rFonts w:eastAsiaTheme="minorHAnsi"/>
-        </w:rPr>
-        <w:t xml:space="preserve">=3), </w:t>
-      </w:r>
-      <w:proofErr w:type="spellStart"/>
-      <w:r>
-        <w:rPr>
-          <w:rStyle w:val="HTMLCode"/>
-          <w:rFonts w:eastAsiaTheme="minorHAnsi"/>
-        </w:rPr>
-        <w:t>n_estimators</w:t>
-      </w:r>
-      <w:proofErr w:type="spellEnd"/>
-      <w:r>
-        <w:rPr>
-          <w:rStyle w:val="HTMLCode"/>
-          <w:rFonts w:eastAsiaTheme="minorHAnsi"/>
-        </w:rPr>
-        <w:t xml:space="preserve">=50, loss='square', </w:t>
-      </w:r>
-      <w:proofErr w:type="spellStart"/>
-      <w:r>
-        <w:rPr>
-          <w:rStyle w:val="HTMLCode"/>
-          <w:rFonts w:eastAsiaTheme="minorHAnsi"/>
-        </w:rPr>
-        <w:t>learning_rate</w:t>
-      </w:r>
-      <w:proofErr w:type="spellEnd"/>
-      <w:r>
-        <w:rPr>
-          <w:rStyle w:val="HTMLCode"/>
-          <w:rFonts w:eastAsiaTheme="minorHAnsi"/>
-        </w:rPr>
-        <w:t>=0.01)</w:t>
+        <w:t>AdaBoostRegressor(random_state=0, estimator=DecisionTreeRegressor(max_depth=3), n_estimators=50, loss='square', learning_rate=0.01)</w:t>
       </w:r>
       <w:r>
         <w:t>, which performed better than the Random Forest model (87.577%) for the insurance charge prediction</w:t>
@@ -13750,7 +13025,7 @@
       </w:r>
     </w:p>
     <w:p>
-      <w:hyperlink r:id="rId8" w:history="1">
+      <w:hyperlink r:id="rId8" w:anchor="module-xgboost.sklearn" w:history="1">
         <w:r>
           <w:rPr>
             <w:rStyle w:val="Hyperlink"/>
@@ -13761,6 +13036,8 @@
       <w:r>
         <w:t xml:space="preserve"> </w:t>
       </w:r>
+      <w:bookmarkStart w:id="0" w:name="_GoBack"/>
+      <w:bookmarkEnd w:id="0"/>
     </w:p>
     <w:tbl>
       <w:tblPr>
@@ -13897,97 +13174,7 @@
                 <w:b/>
                 <w:bCs/>
               </w:rPr>
-              <w:t>initial accuracy of model (</w:t>
-            </w:r>
-            <w:proofErr w:type="spellStart"/>
-            <w:r>
-              <w:rPr>
-                <w:rFonts w:ascii="Calibri" w:eastAsia="Times New Roman" w:hAnsi="Calibri" w:cs="Calibri"/>
-                <w:b/>
-                <w:bCs/>
-              </w:rPr>
-              <w:t>xgb.XGBRegressor</w:t>
-            </w:r>
-            <w:proofErr w:type="spellEnd"/>
-            <w:r>
-              <w:rPr>
-                <w:rFonts w:ascii="Calibri" w:eastAsia="Times New Roman" w:hAnsi="Calibri" w:cs="Calibri"/>
-                <w:b/>
-                <w:bCs/>
-              </w:rPr>
-              <w:t>(objective='</w:t>
-            </w:r>
-            <w:proofErr w:type="spellStart"/>
-            <w:r>
-              <w:rPr>
-                <w:rFonts w:ascii="Calibri" w:eastAsia="Times New Roman" w:hAnsi="Calibri" w:cs="Calibri"/>
-                <w:b/>
-                <w:bCs/>
-              </w:rPr>
-              <w:t>reg:squarederror</w:t>
-            </w:r>
-            <w:proofErr w:type="spellEnd"/>
-            <w:r>
-              <w:rPr>
-                <w:rFonts w:ascii="Calibri" w:eastAsia="Times New Roman" w:hAnsi="Calibri" w:cs="Calibri"/>
-                <w:b/>
-                <w:bCs/>
-              </w:rPr>
-              <w:t xml:space="preserve">', </w:t>
-            </w:r>
-            <w:proofErr w:type="spellStart"/>
-            <w:r>
-              <w:rPr>
-                <w:rFonts w:ascii="Calibri" w:eastAsia="Times New Roman" w:hAnsi="Calibri" w:cs="Calibri"/>
-                <w:b/>
-                <w:bCs/>
-              </w:rPr>
-              <w:t>eval_metric</w:t>
-            </w:r>
-            <w:proofErr w:type="spellEnd"/>
-            <w:r>
-              <w:rPr>
-                <w:rFonts w:ascii="Calibri" w:eastAsia="Times New Roman" w:hAnsi="Calibri" w:cs="Calibri"/>
-                <w:b/>
-                <w:bCs/>
-              </w:rPr>
-              <w:t>='</w:t>
-            </w:r>
-            <w:proofErr w:type="spellStart"/>
-            <w:r>
-              <w:rPr>
-                <w:rFonts w:ascii="Calibri" w:eastAsia="Times New Roman" w:hAnsi="Calibri" w:cs="Calibri"/>
-                <w:b/>
-                <w:bCs/>
-              </w:rPr>
-              <w:t>rmse</w:t>
-            </w:r>
-            <w:proofErr w:type="spellEnd"/>
-            <w:r>
-              <w:rPr>
-                <w:rFonts w:ascii="Calibri" w:eastAsia="Times New Roman" w:hAnsi="Calibri" w:cs="Calibri"/>
-                <w:b/>
-                <w:bCs/>
-              </w:rPr>
-              <w:t xml:space="preserve">',  </w:t>
-            </w:r>
-            <w:proofErr w:type="spellStart"/>
-            <w:r>
-              <w:rPr>
-                <w:rFonts w:ascii="Calibri" w:eastAsia="Times New Roman" w:hAnsi="Calibri" w:cs="Calibri"/>
-                <w:b/>
-                <w:bCs/>
-              </w:rPr>
-              <w:t>random_state</w:t>
-            </w:r>
-            <w:proofErr w:type="spellEnd"/>
-            <w:r>
-              <w:rPr>
-                <w:rFonts w:ascii="Calibri" w:eastAsia="Times New Roman" w:hAnsi="Calibri" w:cs="Calibri"/>
-                <w:b/>
-                <w:bCs/>
-              </w:rPr>
-              <w:t xml:space="preserve">=0)) = </w:t>
+              <w:t xml:space="preserve">initial accuracy of model (xgb.XGBRegressor(objective='reg:squarederror', eval_metric='rmse',  random_state=0)) = </w:t>
             </w:r>
             <w:r>
               <w:rPr>
@@ -14064,7 +13251,6 @@
                 <w:color w:val="000000"/>
               </w:rPr>
             </w:pPr>
-            <w:proofErr w:type="spellStart"/>
             <w:r>
               <w:rPr>
                 <w:rFonts w:ascii="Calibri" w:eastAsia="Times New Roman" w:hAnsi="Calibri" w:cs="Calibri"/>
@@ -14074,7 +13260,6 @@
               </w:rPr>
               <w:t>n_estimators</w:t>
             </w:r>
-            <w:proofErr w:type="spellEnd"/>
           </w:p>
         </w:tc>
         <w:tc>
@@ -14101,7 +13286,6 @@
                 <w:color w:val="000000"/>
               </w:rPr>
             </w:pPr>
-            <w:proofErr w:type="spellStart"/>
             <w:r>
               <w:rPr>
                 <w:rFonts w:ascii="Calibri" w:eastAsia="Times New Roman" w:hAnsi="Calibri" w:cs="Calibri"/>
@@ -14111,7 +13295,6 @@
               </w:rPr>
               <w:t>max_depth</w:t>
             </w:r>
-            <w:proofErr w:type="spellEnd"/>
           </w:p>
         </w:tc>
         <w:tc>
@@ -14138,7 +13321,6 @@
                 <w:color w:val="000000"/>
               </w:rPr>
             </w:pPr>
-            <w:proofErr w:type="spellStart"/>
             <w:r>
               <w:rPr>
                 <w:rFonts w:ascii="Calibri" w:eastAsia="Times New Roman" w:hAnsi="Calibri" w:cs="Calibri"/>
@@ -14148,7 +13330,6 @@
               </w:rPr>
               <w:t>learning_rate</w:t>
             </w:r>
-            <w:proofErr w:type="spellEnd"/>
           </w:p>
         </w:tc>
         <w:tc>
@@ -14210,7 +13391,6 @@
                 <w:color w:val="000000"/>
               </w:rPr>
             </w:pPr>
-            <w:proofErr w:type="spellStart"/>
             <w:r>
               <w:rPr>
                 <w:rFonts w:ascii="Calibri" w:eastAsia="Times New Roman" w:hAnsi="Calibri" w:cs="Calibri"/>
@@ -14220,7 +13400,6 @@
               </w:rPr>
               <w:t>colsample_bytree</w:t>
             </w:r>
-            <w:proofErr w:type="spellEnd"/>
           </w:p>
         </w:tc>
         <w:tc>
@@ -17144,10 +16323,7 @@
         </w:tc>
       </w:tr>
     </w:tbl>
-    <w:p>
-      <w:bookmarkStart w:id="0" w:name="_GoBack"/>
-      <w:bookmarkEnd w:id="0"/>
-    </w:p>
+    <w:p/>
     <w:p>
       <w:pPr>
         <w:spacing w:before="100" w:beforeAutospacing="1" w:after="100" w:afterAutospacing="1" w:line="240" w:lineRule="auto"/>
@@ -17193,7 +16369,6 @@
         </w:rPr>
         <w:t xml:space="preserve"> using the </w:t>
       </w:r>
-      <w:proofErr w:type="spellStart"/>
       <w:r>
         <w:rPr>
           <w:rFonts w:ascii="Times New Roman" w:eastAsia="Times New Roman" w:hAnsi="Times New Roman" w:cs="Times New Roman"/>
@@ -17202,9 +16377,16 @@
           <w:sz w:val="24"/>
           <w:szCs w:val="24"/>
         </w:rPr>
-        <w:t>XGBoost</w:t>
+        <w:t>XGBoost algorithm</w:t>
       </w:r>
-      <w:proofErr w:type="spellEnd"/>
+      <w:r>
+        <w:rPr>
+          <w:rFonts w:ascii="Times New Roman" w:eastAsia="Times New Roman" w:hAnsi="Times New Roman" w:cs="Times New Roman"/>
+          <w:sz w:val="24"/>
+          <w:szCs w:val="24"/>
+        </w:rPr>
+        <w:t xml:space="preserve"> for the </w:t>
+      </w:r>
       <w:r>
         <w:rPr>
           <w:rFonts w:ascii="Times New Roman" w:eastAsia="Times New Roman" w:hAnsi="Times New Roman" w:cs="Times New Roman"/>
@@ -17213,7 +16395,7 @@
           <w:sz w:val="24"/>
           <w:szCs w:val="24"/>
         </w:rPr>
-        <w:t xml:space="preserve"> algorithm</w:t>
+        <w:t>insurance charge prediction</w:t>
       </w:r>
       <w:r>
         <w:rPr>
@@ -17221,7 +16403,7 @@
           <w:sz w:val="24"/>
           <w:szCs w:val="24"/>
         </w:rPr>
-        <w:t xml:space="preserve"> for the </w:t>
+        <w:t xml:space="preserve"> problem, which is </w:t>
       </w:r>
       <w:r>
         <w:rPr>
@@ -17231,47 +16413,7 @@
           <w:sz w:val="24"/>
           <w:szCs w:val="24"/>
         </w:rPr>
-        <w:t>insurance charge prediction</w:t>
-      </w:r>
-      <w:r>
-        <w:rPr>
-          <w:rFonts w:ascii="Times New Roman" w:eastAsia="Times New Roman" w:hAnsi="Times New Roman" w:cs="Times New Roman"/>
-          <w:sz w:val="24"/>
-          <w:szCs w:val="24"/>
-        </w:rPr>
-        <w:t xml:space="preserve"> problem, which is </w:t>
-      </w:r>
-      <w:r>
-        <w:rPr>
-          <w:rFonts w:ascii="Times New Roman" w:eastAsia="Times New Roman" w:hAnsi="Times New Roman" w:cs="Times New Roman"/>
-          <w:b/>
-          <w:bCs/>
-          <w:sz w:val="24"/>
-          <w:szCs w:val="24"/>
-        </w:rPr>
-        <w:t xml:space="preserve">better than the accuracy obtained using the </w:t>
-      </w:r>
-      <w:proofErr w:type="spellStart"/>
-      <w:r>
-        <w:rPr>
-          <w:rFonts w:ascii="Times New Roman" w:eastAsia="Times New Roman" w:hAnsi="Times New Roman" w:cs="Times New Roman"/>
-          <w:b/>
-          <w:bCs/>
-          <w:sz w:val="24"/>
-          <w:szCs w:val="24"/>
-        </w:rPr>
-        <w:t>AdaBoost</w:t>
-      </w:r>
-      <w:proofErr w:type="spellEnd"/>
-      <w:r>
-        <w:rPr>
-          <w:rFonts w:ascii="Times New Roman" w:eastAsia="Times New Roman" w:hAnsi="Times New Roman" w:cs="Times New Roman"/>
-          <w:b/>
-          <w:bCs/>
-          <w:sz w:val="24"/>
-          <w:szCs w:val="24"/>
-        </w:rPr>
-        <w:t xml:space="preserve"> algorithm</w:t>
+        <w:t>better than the accuracy obtained using the AdaBoost algorithm</w:t>
       </w:r>
       <w:r>
         <w:rPr>
@@ -17297,43 +16439,7 @@
           <w:sz w:val="24"/>
           <w:szCs w:val="24"/>
         </w:rPr>
-        <w:t xml:space="preserve">I achieved this performance using the following </w:t>
-      </w:r>
-      <w:proofErr w:type="spellStart"/>
-      <w:r>
-        <w:rPr>
-          <w:rFonts w:ascii="Times New Roman" w:eastAsia="Times New Roman" w:hAnsi="Times New Roman" w:cs="Times New Roman"/>
-          <w:sz w:val="24"/>
-          <w:szCs w:val="24"/>
-        </w:rPr>
-        <w:t>XGBoost</w:t>
-      </w:r>
-      <w:proofErr w:type="spellEnd"/>
-      <w:r>
-        <w:rPr>
-          <w:rFonts w:ascii="Times New Roman" w:eastAsia="Times New Roman" w:hAnsi="Times New Roman" w:cs="Times New Roman"/>
-          <w:sz w:val="24"/>
-          <w:szCs w:val="24"/>
-        </w:rPr>
-        <w:t xml:space="preserve"> </w:t>
-      </w:r>
-      <w:proofErr w:type="spellStart"/>
-      <w:r>
-        <w:rPr>
-          <w:rFonts w:ascii="Times New Roman" w:eastAsia="Times New Roman" w:hAnsi="Times New Roman" w:cs="Times New Roman"/>
-          <w:sz w:val="24"/>
-          <w:szCs w:val="24"/>
-        </w:rPr>
-        <w:t>hyperparameters</w:t>
-      </w:r>
-      <w:proofErr w:type="spellEnd"/>
-      <w:r>
-        <w:rPr>
-          <w:rFonts w:ascii="Times New Roman" w:eastAsia="Times New Roman" w:hAnsi="Times New Roman" w:cs="Times New Roman"/>
-          <w:sz w:val="24"/>
-          <w:szCs w:val="24"/>
-        </w:rPr>
-        <w:t>:</w:t>
+        <w:t>I achieved this performance using the following XGBoost hyperparameters:</w:t>
       </w:r>
     </w:p>
     <w:p>
@@ -17342,62 +16448,11 @@
           <w:rFonts w:ascii="Arial" w:hAnsi="Arial" w:cs="Arial"/>
         </w:rPr>
       </w:pPr>
-      <w:proofErr w:type="spellStart"/>
-      <w:proofErr w:type="gramStart"/>
       <w:r>
         <w:rPr>
           <w:rFonts w:ascii="Arial" w:hAnsi="Arial" w:cs="Arial"/>
         </w:rPr>
-        <w:t>xgb.XGBRegressor</w:t>
-      </w:r>
-      <w:proofErr w:type="spellEnd"/>
-      <w:r>
-        <w:rPr>
-          <w:rFonts w:ascii="Arial" w:hAnsi="Arial" w:cs="Arial"/>
-        </w:rPr>
-        <w:t>(</w:t>
-      </w:r>
-      <w:proofErr w:type="gramEnd"/>
-    </w:p>
-    <w:p>
-      <w:pPr>
-        <w:rPr>
-          <w:rFonts w:ascii="Arial" w:hAnsi="Arial" w:cs="Arial"/>
-        </w:rPr>
-      </w:pPr>
-      <w:r>
-        <w:rPr>
-          <w:rFonts w:ascii="Arial" w:hAnsi="Arial" w:cs="Arial"/>
-        </w:rPr>
-        <w:t xml:space="preserve">    </w:t>
-      </w:r>
-      <w:proofErr w:type="gramStart"/>
-      <w:r>
-        <w:rPr>
-          <w:rFonts w:ascii="Arial" w:hAnsi="Arial" w:cs="Arial"/>
-        </w:rPr>
-        <w:t>objective</w:t>
-      </w:r>
-      <w:proofErr w:type="gramEnd"/>
-      <w:r>
-        <w:rPr>
-          <w:rFonts w:ascii="Arial" w:hAnsi="Arial" w:cs="Arial"/>
-        </w:rPr>
-        <w:t>='</w:t>
-      </w:r>
-      <w:proofErr w:type="spellStart"/>
-      <w:r>
-        <w:rPr>
-          <w:rFonts w:ascii="Arial" w:hAnsi="Arial" w:cs="Arial"/>
-        </w:rPr>
-        <w:t>reg:squarederror</w:t>
-      </w:r>
-      <w:proofErr w:type="spellEnd"/>
-      <w:r>
-        <w:rPr>
-          <w:rFonts w:ascii="Arial" w:hAnsi="Arial" w:cs="Arial"/>
-        </w:rPr>
-        <w:t>',</w:t>
+        <w:t>xgb.XGBRegressor(</w:t>
       </w:r>
     </w:p>
     <w:p>
@@ -17410,35 +16465,7 @@
         <w:rPr>
           <w:rFonts w:ascii="Arial" w:hAnsi="Arial" w:cs="Arial"/>
         </w:rPr>
-        <w:t xml:space="preserve">    </w:t>
-      </w:r>
-      <w:proofErr w:type="spellStart"/>
-      <w:r>
-        <w:rPr>
-          <w:rFonts w:ascii="Arial" w:hAnsi="Arial" w:cs="Arial"/>
-        </w:rPr>
-        <w:t>eval_metric</w:t>
-      </w:r>
-      <w:proofErr w:type="spellEnd"/>
-      <w:r>
-        <w:rPr>
-          <w:rFonts w:ascii="Arial" w:hAnsi="Arial" w:cs="Arial"/>
-        </w:rPr>
-        <w:t>='</w:t>
-      </w:r>
-      <w:proofErr w:type="spellStart"/>
-      <w:r>
-        <w:rPr>
-          <w:rFonts w:ascii="Arial" w:hAnsi="Arial" w:cs="Arial"/>
-        </w:rPr>
-        <w:t>rmse</w:t>
-      </w:r>
-      <w:proofErr w:type="spellEnd"/>
-      <w:r>
-        <w:rPr>
-          <w:rFonts w:ascii="Arial" w:hAnsi="Arial" w:cs="Arial"/>
-        </w:rPr>
-        <w:t>',</w:t>
+        <w:t xml:space="preserve">    objective='reg:squarederror',</w:t>
       </w:r>
     </w:p>
     <w:p>
@@ -17451,22 +16478,7 @@
         <w:rPr>
           <w:rFonts w:ascii="Arial" w:hAnsi="Arial" w:cs="Arial"/>
         </w:rPr>
-        <w:lastRenderedPageBreak/>
-        <w:t xml:space="preserve">    </w:t>
-      </w:r>
-      <w:proofErr w:type="spellStart"/>
-      <w:r>
-        <w:rPr>
-          <w:rFonts w:ascii="Arial" w:hAnsi="Arial" w:cs="Arial"/>
-        </w:rPr>
-        <w:t>random_state</w:t>
-      </w:r>
-      <w:proofErr w:type="spellEnd"/>
-      <w:r>
-        <w:rPr>
-          <w:rFonts w:ascii="Arial" w:hAnsi="Arial" w:cs="Arial"/>
-        </w:rPr>
-        <w:t>=0,</w:t>
+        <w:t xml:space="preserve">    eval_metric='rmse',</w:t>
       </w:r>
     </w:p>
     <w:p>
@@ -17479,21 +16491,8 @@
         <w:rPr>
           <w:rFonts w:ascii="Arial" w:hAnsi="Arial" w:cs="Arial"/>
         </w:rPr>
-        <w:t xml:space="preserve">    </w:t>
-      </w:r>
-      <w:proofErr w:type="spellStart"/>
-      <w:r>
-        <w:rPr>
-          <w:rFonts w:ascii="Arial" w:hAnsi="Arial" w:cs="Arial"/>
-        </w:rPr>
-        <w:t>n_estimators</w:t>
-      </w:r>
-      <w:proofErr w:type="spellEnd"/>
-      <w:r>
-        <w:rPr>
-          <w:rFonts w:ascii="Arial" w:hAnsi="Arial" w:cs="Arial"/>
-        </w:rPr>
-        <w:t>=60,</w:t>
+        <w:lastRenderedPageBreak/>
+        <w:t xml:space="preserve">    random_state=0,</w:t>
       </w:r>
     </w:p>
     <w:p>
@@ -17506,21 +16505,7 @@
         <w:rPr>
           <w:rFonts w:ascii="Arial" w:hAnsi="Arial" w:cs="Arial"/>
         </w:rPr>
-        <w:t xml:space="preserve">    </w:t>
-      </w:r>
-      <w:proofErr w:type="spellStart"/>
-      <w:r>
-        <w:rPr>
-          <w:rFonts w:ascii="Arial" w:hAnsi="Arial" w:cs="Arial"/>
-        </w:rPr>
-        <w:t>learning_rate</w:t>
-      </w:r>
-      <w:proofErr w:type="spellEnd"/>
-      <w:r>
-        <w:rPr>
-          <w:rFonts w:ascii="Arial" w:hAnsi="Arial" w:cs="Arial"/>
-        </w:rPr>
-        <w:t>=0.1,</w:t>
+        <w:t xml:space="preserve">    n_estimators=60,</w:t>
       </w:r>
     </w:p>
     <w:p>
@@ -17533,21 +16518,7 @@
         <w:rPr>
           <w:rFonts w:ascii="Arial" w:hAnsi="Arial" w:cs="Arial"/>
         </w:rPr>
-        <w:t xml:space="preserve">    </w:t>
-      </w:r>
-      <w:proofErr w:type="spellStart"/>
-      <w:r>
-        <w:rPr>
-          <w:rFonts w:ascii="Arial" w:hAnsi="Arial" w:cs="Arial"/>
-        </w:rPr>
-        <w:t>max_depth</w:t>
-      </w:r>
-      <w:proofErr w:type="spellEnd"/>
-      <w:r>
-        <w:rPr>
-          <w:rFonts w:ascii="Arial" w:hAnsi="Arial" w:cs="Arial"/>
-        </w:rPr>
-        <w:t>=3,</w:t>
+        <w:t xml:space="preserve">    learning_rate=0.1,</w:t>
       </w:r>
     </w:p>
     <w:p>
@@ -17560,21 +16531,7 @@
         <w:rPr>
           <w:rFonts w:ascii="Arial" w:hAnsi="Arial" w:cs="Arial"/>
         </w:rPr>
-        <w:t xml:space="preserve">    </w:t>
-      </w:r>
-      <w:proofErr w:type="gramStart"/>
-      <w:r>
-        <w:rPr>
-          <w:rFonts w:ascii="Arial" w:hAnsi="Arial" w:cs="Arial"/>
-        </w:rPr>
-        <w:t>subsample=</w:t>
-      </w:r>
-      <w:proofErr w:type="gramEnd"/>
-      <w:r>
-        <w:rPr>
-          <w:rFonts w:ascii="Arial" w:hAnsi="Arial" w:cs="Arial"/>
-        </w:rPr>
-        <w:t>0.9,</w:t>
+        <w:t xml:space="preserve">    max_depth=3,</w:t>
       </w:r>
     </w:p>
     <w:p>
@@ -17587,21 +16544,20 @@
         <w:rPr>
           <w:rFonts w:ascii="Arial" w:hAnsi="Arial" w:cs="Arial"/>
         </w:rPr>
-        <w:t xml:space="preserve">    </w:t>
+        <w:t xml:space="preserve">    subsample=0.9,</w:t>
       </w:r>
-      <w:proofErr w:type="spellStart"/>
+    </w:p>
+    <w:p>
+      <w:pPr>
+        <w:rPr>
+          <w:rFonts w:ascii="Arial" w:hAnsi="Arial" w:cs="Arial"/>
+        </w:rPr>
+      </w:pPr>
       <w:r>
         <w:rPr>
           <w:rFonts w:ascii="Arial" w:hAnsi="Arial" w:cs="Arial"/>
         </w:rPr>
-        <w:t>colsample_bytree</w:t>
-      </w:r>
-      <w:proofErr w:type="spellEnd"/>
-      <w:r>
-        <w:rPr>
-          <w:rFonts w:ascii="Arial" w:hAnsi="Arial" w:cs="Arial"/>
-        </w:rPr>
-        <w:t>=0.8</w:t>
+        <w:t xml:space="preserve">    colsample_bytree=0.8</w:t>
       </w:r>
     </w:p>
     <w:p>
@@ -17626,8 +16582,105 @@
     </w:p>
     <w:p>
       <w:pPr>
-        <w:rPr>
-          <w:rFonts w:ascii="Arial" w:hAnsi="Arial" w:cs="Arial"/>
+        <w:pStyle w:val="Heading1"/>
+      </w:pPr>
+      <w:r>
+        <w:t xml:space="preserve">Light GBM boosting algorithm </w:t>
+      </w:r>
+    </w:p>
+    <w:p/>
+    <w:p>
+      <w:r>
+        <w:drawing>
+          <wp:inline distT="0" distB="0" distL="0" distR="0" wp14:anchorId="1A74DAD7" wp14:editId="5A2F3EF3">
+            <wp:extent cx="4858428" cy="4305901"/>
+            <wp:effectExtent l="0" t="0" r="0" b="0"/>
+            <wp:docPr id="2" name="Picture 2"/>
+            <wp:cNvGraphicFramePr>
+              <a:graphicFrameLocks xmlns:a="http://schemas.openxmlformats.org/drawingml/2006/main" noChangeAspect="1"/>
+            </wp:cNvGraphicFramePr>
+            <a:graphic xmlns:a="http://schemas.openxmlformats.org/drawingml/2006/main">
+              <a:graphicData uri="http://schemas.openxmlformats.org/drawingml/2006/picture">
+                <pic:pic xmlns:pic="http://schemas.openxmlformats.org/drawingml/2006/picture">
+                  <pic:nvPicPr>
+                    <pic:cNvPr id="1" name=""/>
+                    <pic:cNvPicPr/>
+                  </pic:nvPicPr>
+                  <pic:blipFill>
+                    <a:blip r:embed="rId9"/>
+                    <a:stretch>
+                      <a:fillRect/>
+                    </a:stretch>
+                  </pic:blipFill>
+                  <pic:spPr>
+                    <a:xfrm>
+                      <a:off x="0" y="0"/>
+                      <a:ext cx="4858428" cy="4305901"/>
+                    </a:xfrm>
+                    <a:prstGeom prst="rect">
+                      <a:avLst/>
+                    </a:prstGeom>
+                  </pic:spPr>
+                </pic:pic>
+              </a:graphicData>
+            </a:graphic>
+          </wp:inline>
+        </w:drawing>
+      </w:r>
+    </w:p>
+    <w:p>
+      <w:r>
+        <w:t>Best model accuracy using the following parameters:-</w:t>
+      </w:r>
+    </w:p>
+    <w:p>
+      <w:r>
+        <w:t>lgb.LGBMRegressor(boosting_type='gbdt', num_leaves=16, max_depth=4, learning_rate=0.03, n_estimators=200)</w:t>
+      </w:r>
+    </w:p>
+    <w:p>
+      <w:pPr>
+        <w:rPr>
+          <w:b/>
+        </w:rPr>
+      </w:pPr>
+      <w:r>
+        <w:lastRenderedPageBreak/>
+        <w:t xml:space="preserve">The model achieved an accuracy </w:t>
+      </w:r>
+      <w:r>
+        <w:rPr>
+          <w:highlight w:val="yellow"/>
+        </w:rPr>
+        <w:t>of 90%</w:t>
+      </w:r>
+      <w:r>
+        <w:t xml:space="preserve"> using LightGBM, which is comparable to the performance of the XGBoost algorithm. Therefore, I conclude </w:t>
+      </w:r>
+      <w:r>
+        <w:rPr>
+          <w:b/>
+        </w:rPr>
+        <w:t>that both XGBoost and LightGBM perform well f</w:t>
+      </w:r>
+      <w:r>
+        <w:rPr>
+          <w:b/>
+        </w:rPr>
+        <w:t>or insurance charge prediction.</w:t>
+      </w:r>
+    </w:p>
+    <w:p>
+      <w:pPr>
+        <w:rPr>
+          <w:b/>
+        </w:rPr>
+      </w:pPr>
+    </w:p>
+    <w:p>
+      <w:pPr>
+        <w:rPr>
+          <w:b/>
         </w:rPr>
       </w:pPr>
     </w:p>

</xml_diff>